<commit_message>
Replace recency term with time since last access
</commit_message>
<xml_diff>
--- a/40 - Projects/Диплом/build/Диплом_ГришинИД_v003.docx
+++ b/40 - Projects/Диплом/build/Диплом_ГришинИД_v003.docx
@@ -997,7 +997,7 @@
         <w:pStyle w:val="a2"/>
       </w:pPr>
       <w:r>
-        <w:t xml:space="preserve">Проблема заключается в выборе класса при неизвестной будущей востребованности объекта. Решение должно учитывать историю обращений, ёмкость классов, задержку доступа и затраты переноса. Правила жизненного цикла (англ. Lifecycle) используют возраст и другие заданные условия, а реактивные политики используют давность и частоту обращений. Методы машинного обучения (англ. Machine Learning, далее ML) позволяют прогнозировать спрос, но требуют дополнительных ресурсов и не гарантируют преимущества на любой нагрузке [1], [2], [3], [4].</w:t>
+        <w:t xml:space="preserve">Проблема заключается в выборе класса при неизвестной будущей востребованности объекта. Решение должно учитывать историю обращений, ёмкость классов, задержку доступа и затраты переноса. Правила жизненного цикла (англ. Lifecycle) используют возраст и другие заданные условия, а реактивные политики используют время с последнего обращения и частоту обращений. Методы машинного обучения (англ. Machine Learning, далее ML) позволяют прогнозировать спрос, но требуют дополнительных ресурсов и не гарантируют преимущества на любой нагрузке [1], [2], [3], [4].</w:t>
       </w:r>
     </w:p>
     <w:p>
@@ -1854,7 +1854,7 @@
         <w:pStyle w:val="FirstParagraph"/>
       </w:pPr>
       <w:r>
-        <w:t xml:space="preserve">Востребованность характеризует ожидаемое использование объекта за будущий интервал. Она не определяется только возрастом: старые данные могут регулярно читаться, а новые могут быстро терять спрос. Для прогноза используются давность, частота и объём чтений, а также их изменение во времени. Отсутствие истории у нового объекта не означает отсутствие спроса.</w:t>
+        <w:t xml:space="preserve">Востребованность характеризует ожидаемое использование объекта за будущий интервал. Она не определяется только возрастом: старые данные могут регулярно читаться, а новые могут быстро терять спрос. Для прогноза используются время с последнего обращения, частота и объём чтений, а также их изменение во времени. Отсутствие истории у нового объекта не означает отсутствие спроса.</w:t>
       </w:r>
     </w:p>
     <w:p>
@@ -1882,7 +1882,7 @@
         <w:pStyle w:val="FirstParagraph"/>
       </w:pPr>
       <w:r>
-        <w:t xml:space="preserve">При ручном размещении класс определяет администратор или приложение. Lifecycle автоматизирует статические условия перехода, например возраст и фильтры [2], [8]. Реактивные политики используют прошлые обращения: принцип давности (англ. Least Recently Used, далее LRU), частоты (англ. Least Frequently Used, далее LFU) или экспоненциально взвешенное скользящее среднее (англ. Exponentially Weighted Moving Average, далее EWMA). Они дают понятные базовые решения, но могут запаздывать при смене спроса.</w:t>
+        <w:t xml:space="preserve">При ручном размещении класс определяет администратор или приложение. Lifecycle автоматизирует статические условия перехода, например возраст и фильтры [2], [8]. Реактивные политики используют прошлые обращения: время с последнего обращения (англ. Least Recently Used, далее LRU), частоту обращений (англ. Least Frequently Used, далее LFU) или экспоненциально взвешенное скользящее среднее (англ. Exponentially Weighted Moving Average, далее EWMA). Они дают понятные базовые решения, но могут запаздывать при смене спроса.</w:t>
       </w:r>
     </w:p>
     <w:p>
@@ -2948,7 +2948,7 @@
                 <w:sz w:val="24"/>
                 <w:szCs w:val="24"/>
               </w:rPr>
-              <w:t xml:space="preserve">Lifecycle или давность доступа</w:t>
+              <w:t xml:space="preserve">Lifecycle или время с последнего обращения</w:t>
             </w:r>
           </w:p>
         </w:tc>
@@ -5356,7 +5356,7 @@
         <w:pStyle w:val="FirstParagraph"/>
       </w:pPr>
       <w:r>
-        <w:t xml:space="preserve">Основным показателем является средняя задержка завершённого чтения от заданного момента поступления запроса до последнего байта, включая очередь и миграции. Прогноз сравнивается с настроенными политиками по возрасту, давности и частоте обращений и вариантом без модели с тем же планировщиком и исполнителем. Нагрузка, начальное размещение, ресурсы, бюджет и условия подтверждения одинаковы. Параметры подбираются до итогового теста.</w:t>
+        <w:t xml:space="preserve">Основным показателем является средняя задержка завершённого чтения от заданного момента поступления запроса до последнего байта, включая очередь и миграции. Прогноз сравнивается с настроенными политиками по возрасту, времени с последнего обращения и частоте обращений и вариантом без модели с тем же планировщиком и исполнителем. Нагрузка, начальное размещение, ресурсы, бюджет и условия подтверждения одинаковы. Параметры подбираются до итогового теста.</w:t>
       </w:r>
     </w:p>
     <w:p>
@@ -14410,9 +14410,9 @@
         <w:tblCaption w:val="Таблица 2.3 — Сравнение исходного и проектируемого процессов"/>
       </w:tblPr>
       <w:tblGrid>
-        <w:gridCol w:w="2465"/>
-        <w:gridCol w:w="3447"/>
-        <w:gridCol w:w="3726"/>
+        <w:gridCol w:w="2334"/>
+        <w:gridCol w:w="4238"/>
+        <w:gridCol w:w="3066"/>
       </w:tblGrid>
       <w:tr>
         <w:trPr>
@@ -14421,7 +14421,7 @@
         </w:trPr>
         <w:tc>
           <w:tcPr>
-            <w:tcW w:w="2465" w:type="dxa"/>
+            <w:tcW w:w="2334" w:type="dxa"/>
           </w:tcPr>
           <w:p>
             <w:pPr>
@@ -14445,7 +14445,7 @@
         </w:tc>
         <w:tc>
           <w:tcPr>
-            <w:tcW w:w="3447" w:type="dxa"/>
+            <w:tcW w:w="4238" w:type="dxa"/>
           </w:tcPr>
           <w:p>
             <w:pPr>
@@ -14469,7 +14469,7 @@
         </w:tc>
         <w:tc>
           <w:tcPr>
-            <w:tcW w:w="3726" w:type="dxa"/>
+            <w:tcW w:w="3066" w:type="dxa"/>
           </w:tcPr>
           <w:p>
             <w:pPr>
@@ -14498,7 +14498,7 @@
         </w:trPr>
         <w:tc>
           <w:tcPr>
-            <w:tcW w:w="2465" w:type="dxa"/>
+            <w:tcW w:w="2334" w:type="dxa"/>
           </w:tcPr>
           <w:p>
             <w:pPr>
@@ -14521,7 +14521,7 @@
         </w:tc>
         <w:tc>
           <w:tcPr>
-            <w:tcW w:w="3447" w:type="dxa"/>
+            <w:tcW w:w="4238" w:type="dxa"/>
           </w:tcPr>
           <w:p>
             <w:pPr>
@@ -14544,7 +14544,7 @@
         </w:tc>
         <w:tc>
           <w:tcPr>
-            <w:tcW w:w="3726" w:type="dxa"/>
+            <w:tcW w:w="3066" w:type="dxa"/>
           </w:tcPr>
           <w:p>
             <w:pPr>
@@ -14572,7 +14572,7 @@
         </w:trPr>
         <w:tc>
           <w:tcPr>
-            <w:tcW w:w="2465" w:type="dxa"/>
+            <w:tcW w:w="2334" w:type="dxa"/>
           </w:tcPr>
           <w:p>
             <w:pPr>
@@ -14595,7 +14595,7 @@
         </w:tc>
         <w:tc>
           <w:tcPr>
-            <w:tcW w:w="3447" w:type="dxa"/>
+            <w:tcW w:w="4238" w:type="dxa"/>
           </w:tcPr>
           <w:p>
             <w:pPr>
@@ -14612,13 +14612,13 @@
                 <w:sz w:val="24"/>
                 <w:szCs w:val="24"/>
               </w:rPr>
-              <w:t xml:space="preserve">Вручную по давности и возрасту</w:t>
-            </w:r>
-          </w:p>
-        </w:tc>
-        <w:tc>
-          <w:tcPr>
-            <w:tcW w:w="3726" w:type="dxa"/>
+              <w:t xml:space="preserve">Вручную по времени с последнего обращения и возрасту</w:t>
+            </w:r>
+          </w:p>
+        </w:tc>
+        <w:tc>
+          <w:tcPr>
+            <w:tcW w:w="3066" w:type="dxa"/>
           </w:tcPr>
           <w:p>
             <w:pPr>
@@ -14646,7 +14646,7 @@
         </w:trPr>
         <w:tc>
           <w:tcPr>
-            <w:tcW w:w="2465" w:type="dxa"/>
+            <w:tcW w:w="2334" w:type="dxa"/>
           </w:tcPr>
           <w:p>
             <w:pPr>
@@ -14669,7 +14669,7 @@
         </w:tc>
         <w:tc>
           <w:tcPr>
-            <w:tcW w:w="3447" w:type="dxa"/>
+            <w:tcW w:w="4238" w:type="dxa"/>
           </w:tcPr>
           <w:p>
             <w:pPr>
@@ -14692,7 +14692,7 @@
         </w:tc>
         <w:tc>
           <w:tcPr>
-            <w:tcW w:w="3726" w:type="dxa"/>
+            <w:tcW w:w="3066" w:type="dxa"/>
           </w:tcPr>
           <w:p>
             <w:pPr>
@@ -14720,7 +14720,7 @@
         </w:trPr>
         <w:tc>
           <w:tcPr>
-            <w:tcW w:w="2465" w:type="dxa"/>
+            <w:tcW w:w="2334" w:type="dxa"/>
           </w:tcPr>
           <w:p>
             <w:pPr>
@@ -14743,7 +14743,7 @@
         </w:tc>
         <w:tc>
           <w:tcPr>
-            <w:tcW w:w="3447" w:type="dxa"/>
+            <w:tcW w:w="4238" w:type="dxa"/>
           </w:tcPr>
           <w:p>
             <w:pPr>
@@ -14766,7 +14766,7 @@
         </w:tc>
         <w:tc>
           <w:tcPr>
-            <w:tcW w:w="3726" w:type="dxa"/>
+            <w:tcW w:w="3066" w:type="dxa"/>
           </w:tcPr>
           <w:p>
             <w:pPr>
@@ -14794,7 +14794,7 @@
         </w:trPr>
         <w:tc>
           <w:tcPr>
-            <w:tcW w:w="2465" w:type="dxa"/>
+            <w:tcW w:w="2334" w:type="dxa"/>
           </w:tcPr>
           <w:p>
             <w:pPr>
@@ -14817,7 +14817,7 @@
         </w:tc>
         <w:tc>
           <w:tcPr>
-            <w:tcW w:w="3447" w:type="dxa"/>
+            <w:tcW w:w="4238" w:type="dxa"/>
           </w:tcPr>
           <w:p>
             <w:pPr>
@@ -14840,7 +14840,7 @@
         </w:tc>
         <w:tc>
           <w:tcPr>
-            <w:tcW w:w="3726" w:type="dxa"/>
+            <w:tcW w:w="3066" w:type="dxa"/>
           </w:tcPr>
           <w:p>
             <w:pPr>
@@ -14868,7 +14868,7 @@
         </w:trPr>
         <w:tc>
           <w:tcPr>
-            <w:tcW w:w="2465" w:type="dxa"/>
+            <w:tcW w:w="2334" w:type="dxa"/>
           </w:tcPr>
           <w:p>
             <w:pPr>
@@ -14891,7 +14891,7 @@
         </w:tc>
         <w:tc>
           <w:tcPr>
-            <w:tcW w:w="3447" w:type="dxa"/>
+            <w:tcW w:w="4238" w:type="dxa"/>
           </w:tcPr>
           <w:p>
             <w:pPr>
@@ -14914,7 +14914,7 @@
         </w:tc>
         <w:tc>
           <w:tcPr>
-            <w:tcW w:w="3726" w:type="dxa"/>
+            <w:tcW w:w="3066" w:type="dxa"/>
           </w:tcPr>
           <w:p>
             <w:pPr>
@@ -14942,7 +14942,7 @@
         </w:trPr>
         <w:tc>
           <w:tcPr>
-            <w:tcW w:w="2465" w:type="dxa"/>
+            <w:tcW w:w="2334" w:type="dxa"/>
           </w:tcPr>
           <w:p>
             <w:pPr>
@@ -14965,7 +14965,7 @@
         </w:tc>
         <w:tc>
           <w:tcPr>
-            <w:tcW w:w="3447" w:type="dxa"/>
+            <w:tcW w:w="4238" w:type="dxa"/>
           </w:tcPr>
           <w:p>
             <w:pPr>
@@ -14988,7 +14988,7 @@
         </w:tc>
         <w:tc>
           <w:tcPr>
-            <w:tcW w:w="3726" w:type="dxa"/>
+            <w:tcW w:w="3066" w:type="dxa"/>
           </w:tcPr>
           <w:p>
             <w:pPr>

</xml_diff>